<commit_message>
Rà soát từng câu bài nói Phần V đến XV, làm rõ các chỗ diễn đạt mơ hồ
Sửa khoảng 90 chỗ: động từ thiếu đối tượng (thu hẹp dần cái gì),
đại từ không rõ chỉ cái gì, hình ảnh ẩn dụ chưa được giải thích
(mọc ra, đứt mạch, viết theo cột, tự đứng được...). Nội dung giữ nguyên.

Co-Authored-By: Claude Opus 5.5 <noreply@anthropic.com>
Claude-Session: https://claude.ai/code/session_018fvDs5YVdMu929akP2CKw7
</commit_message>
<xml_diff>
--- a/Core_Slide_1_HD1_PhanV-XV_van_noi.docx
+++ b/Core_Slide_1_HD1_PhanV-XV_van_noi.docx
@@ -2377,31 +2377,31 @@
         <w:spacing w:after="160"/>
       </w:pPr>
       <w:r>
-        <w:t>Rồi, mình bước sang Phần năm, phần nói về đề cương khóa luận. Trước khi được viết khóa luận hoàn chỉnh, các em phải nộp một bản đề cương để giảng viên hướng dẫn và khoa xét duyệt đề tài. Nghe qua thì giống một thủ tục hành chính nhưng thầy muốn các em nhìn nó theo một cách khác.</w:t>
-      </w:r>
-    </w:p>
-    <w:p>
-      <w:pPr>
-        <w:spacing w:after="160"/>
-      </w:pPr>
-      <w:r>
-        <w:t>Ở đây các em cần hiểu một chuyện. Khóa luận là một công trình dài, thường từ năm mươi trang trở lên, mà công trình càng dài thì càng có một cái nguy hiểm rất riêng: nếu đi sai hướng từ đầu, các em sẽ không thấy ngay. Các em cứ viết tiếp, viết mãi, tới giữa chừng mới phát hiện phần này không khớp với phần kia và lúc đó thì sửa rất cực.</w:t>
-      </w:r>
-    </w:p>
-    <w:p>
-      <w:pPr>
-        <w:spacing w:after="160"/>
-      </w:pPr>
-      <w:r>
-        <w:t>Đề cương có mặt chính là để những lỗi như vậy lộ ra sớm. Nó là một lần dừng lại để thầy cô hướng dẫn nhìn được toàn bộ kế hoạch của các em, trước khi các em đổ công sức vào năm chương.</w:t>
-      </w:r>
-    </w:p>
-    <w:p>
-      <w:pPr>
-        <w:spacing w:after="160"/>
-      </w:pPr>
-      <w:r>
-        <w:t>Thử hình dung thế này. Một bạn làm đề cương sơ sài vì nghĩ mình đã hiểu đề tài rồi, nên xin viết thẳng khóa luận luôn. Tới lúc đọc Chương một mới thấy phần đối tượng ghi là khách hàng doanh nghiệp, trong khi bảng hỏi ở phần phương pháp lại thiết kế cho khách hàng cá nhân, tức là hai chỗ đá nhau. Nếu lỗi này lộ ra ở bước đề cương thì chỉ mất nửa buổi để sửa. Còn vì nó lộ ra muộn nên bạn đó phải viết lại cả phần phương pháp, mất gần một tuần.</w:t>
+        <w:t>Rồi, mình bước sang Phần năm, phần nói về đề cương khóa luận. Trước khi được viết khóa luận hoàn chỉnh, các em phải nộp một bản đề cương để giảng viên hướng dẫn và khoa xét duyệt đề tài. Nghe qua thì giống một thủ tục hành chính nhưng thầy muốn các em nhìn bản đề cương theo một cách khác.</w:t>
+      </w:r>
+    </w:p>
+    <w:p>
+      <w:pPr>
+        <w:spacing w:after="160"/>
+      </w:pPr>
+      <w:r>
+        <w:t>Ở đây các em cần hiểu một chuyện. Khóa luận là một công trình dài, thường từ năm mươi trang trở lên, mà công trình càng dài thì càng có một cái nguy hiểm rất riêng: nếu đi sai hướng từ đầu, các em sẽ không thấy ngay. Các em cứ viết tiếp, viết mãi, tới giữa chừng mới phát hiện các phần không khớp nhau, chẳng hạn đối tượng nghiên cứu ghi một đằng mà cách thu thập dữ liệu lại thiết kế một nẻo. Lúc đó sửa rất cực, bởi vì những phần viết sau đều đã dựa trên phần bị sai.</w:t>
+      </w:r>
+    </w:p>
+    <w:p>
+      <w:pPr>
+        <w:spacing w:after="160"/>
+      </w:pPr>
+      <w:r>
+        <w:t>Đề cương có mặt chính là để những lỗi sai hướng như vậy lộ ra sớm. Đề cương là một điểm dừng bắt buộc để thầy cô hướng dẫn nhìn được toàn bộ kế hoạch của các em, trước khi các em đổ công sức vào năm chương.</w:t>
+      </w:r>
+    </w:p>
+    <w:p>
+      <w:pPr>
+        <w:spacing w:after="160"/>
+      </w:pPr>
+      <w:r>
+        <w:t>Thử hình dung thế này. Một bạn làm đề cương sơ sài vì nghĩ mình đã hiểu đề tài rồi, nên xin viết thẳng khóa luận luôn. Tới lúc đọc Chương một mới thấy phần đối tượng ghi là khách hàng doanh nghiệp, trong khi bảng hỏi ở phần phương pháp lại thiết kế cho khách hàng cá nhân, tức là hai phần mâu thuẫn nhau. Nếu lỗi này lộ ra ở bước đề cương thì chỉ mất nửa buổi để sửa. Còn vì nó lộ ra muộn nên bạn đó phải viết lại cả phần phương pháp, mất gần một tuần.</w:t>
       </w:r>
     </w:p>
     <w:p>
@@ -2452,7 +2452,7 @@
         <w:spacing w:after="160"/>
       </w:pPr>
       <w:r>
-        <w:t>Mình bắt đầu từ chỗ mà nhiều bạn nghĩ là ít quan trọng nhất, đó là bốn danh mục phải đặt trước Mục 1 của đề cương, các em nhìn trên slide là thấy.</w:t>
+        <w:t>Mình bắt đầu từ phần mà nhiều bạn nghĩ là ít quan trọng nhất, đó là bốn danh mục phải đặt trước Mục 1 của đề cương, các em nhìn trên slide là thấy.</w:t>
       </w:r>
     </w:p>
     <w:p>
@@ -2469,7 +2469,7 @@
         <w:t>đề cương chưa có bảng nào, chưa có hình nào thì vẫn phải có danh mục bảng và danh mục hình.</w:t>
       </w:r>
       <w:r>
-        <w:t xml:space="preserve"> Nghe hơi lạ đúng không? Lý do là các em đang làm theo một cấu trúc chuẩn, mà cấu trúc chuẩn thì không co giãn theo chuyện bài mình đang có gì hay chưa có gì.</w:t>
+        <w:t xml:space="preserve"> Nghe hơi lạ đúng không? Lý do là các em đang làm theo một cấu trúc chuẩn mà cấu trúc đó quy định đề cương phải có đủ bốn danh mục, bất kể bài của các em lúc đó đã có bảng, có hình hay chưa.</w:t>
       </w:r>
     </w:p>
     <w:p>
@@ -2485,7 +2485,7 @@
         <w:spacing w:after="160"/>
       </w:pPr>
       <w:r>
-        <w:t>Mà các em để ý, cái giá của lỗi này không cân xứng chút nào. Làm đúng từ đầu chỉ mất chừng nửa tiếng, còn nếu bị trả bài vì thiếu nó thì các em mất thêm một vòng nộp, một vòng chờ, có khi tới vài ngày.</w:t>
+        <w:t>Mà các em để ý, cái giá của lỗi này không cân xứng chút nào. Làm đúng từ đầu chỉ mất chừng nửa tiếng, còn nếu bị trả bài vì thiếu bốn danh mục này thì các em mất thêm một vòng nộp, một vòng chờ, có khi tới vài ngày.</w:t>
       </w:r>
     </w:p>
     <w:p>
@@ -2520,7 +2520,7 @@
         <w:spacing w:after="160"/>
       </w:pPr>
       <w:r>
-        <w:t>Giờ mình vào phần nội dung. Slide này gom Mục 1, Mục 2 và Mục 3 lại một chỗ, bởi vì ba mục này phải được đọc liền một mạch. Nếu tách riêng ra thì mục nào nghe cũng ổn, chỉ khi đặt cạnh nhau mình mới biết chúng có thật sự nối được với nhau hay không.</w:t>
+        <w:t>Giờ mình vào phần nội dung. Slide này gom Mục 1, Mục 2 và Mục 3 lại một chỗ, bởi vì ba mục này phải được đọc liền một mạch. Nếu tách riêng ra thì mục nào nghe cũng ổn, chỉ khi đặt cạnh nhau mình mới biết mục tiêu có giải quyết đúng vấn đề đã nêu không và câu hỏi có cụ thể hóa đúng mục tiêu không.</w:t>
       </w:r>
     </w:p>
     <w:p>
@@ -2536,15 +2536,15 @@
         <w:spacing w:after="160"/>
       </w:pPr>
       <w:r>
-        <w:t>Ở Mục 1.2 có một chỗ rất nhiều bạn nhầm. Tại đây các em được khảo lược ngắn vài nghiên cứu liên quan nhưng mục đích chỉ là cho thấy đề tài của mình không trùng với ai. Còn phần tổng quan đầy đủ, có so sánh và có phê phán, thì phải để dành hết cho Mục 8.</w:t>
-      </w:r>
-    </w:p>
-    <w:p>
-      <w:pPr>
-        <w:spacing w:after="160"/>
-      </w:pPr>
-      <w:r>
-        <w:t xml:space="preserve">Cái thầy muốn nói ở đây là quy định này không phải chuyện đặt chữ ở đâu cho gọn, mà là vì hai mục làm hai việc khác nhau. </w:t>
+        <w:t>Ở Mục 1.2 có một điểm rất nhiều bạn nhầm. Tại đây các em được khảo lược ngắn vài nghiên cứu liên quan nhưng mục đích chỉ là cho thấy đề tài của mình không trùng với ai. Còn phần tổng quan đầy đủ, có so sánh và có phê phán, thì phải để dành hết cho Mục 8.</w:t>
+      </w:r>
+    </w:p>
+    <w:p>
+      <w:pPr>
+        <w:spacing w:after="160"/>
+      </w:pPr>
+      <w:r>
+        <w:t xml:space="preserve">Cái thầy muốn nói ở đây là quy định này không phải chuyện hình thức, tức là không phải chỉ để sắp xếp chữ cho gọn, mà vì hai mục làm hai việc khác nhau. </w:t>
       </w:r>
       <w:r>
         <w:rPr>
@@ -2578,7 +2578,7 @@
         <w:t>mục tiêu cụ thể và câu hỏi nghiên cứu phải khớp nhau từng cặp.</w:t>
       </w:r>
       <w:r>
-        <w:t xml:space="preserve"> Nếu có ba mục tiêu cụ thể mà chỉ có hai câu hỏi thì một mục tiêu đang bị bỏ rơi. Ngược lại, nếu có một câu hỏi mà không có mục tiêu nào đứng sau thì câu hỏi đó từ đâu mà ra? Cách kiểm tra rất đơn giản: các em đặt hai mục cạnh nhau rồi dò từng dòng, lệch ở chỗ nào là thấy ngay chỗ đó.</w:t>
+        <w:t xml:space="preserve"> Nếu có ba mục tiêu cụ thể mà chỉ có hai câu hỏi thì một mục tiêu đang bị bỏ rơi. Ngược lại, nếu có một câu hỏi mà không có mục tiêu nào đứng sau thì câu hỏi đó từ đâu mà ra? Cách kiểm tra rất đơn giản: các em đặt Mục 2.2 cạnh Mục 3 rồi dò từng cặp mục tiêu và câu hỏi, cặp nào thiếu một vế là thấy ngay.</w:t>
       </w:r>
     </w:p>
     <w:p>
@@ -2607,7 +2607,7 @@
         <w:spacing w:after="160"/>
       </w:pPr>
       <w:r>
-        <w:t>Các em đọc tiêu đề slide này trước: phạm vi và phương pháp phải trả lời được câu hỏi đã đặt ra ở Mục 3. Các em giữ câu đó trong đầu nhé, vì cả slide này xoay quanh nó.</w:t>
+        <w:t>Các em đọc tiêu đề slide này trước: phạm vi và phương pháp phải trả lời được câu hỏi đã đặt ra ở Mục 3. Các em giữ câu đó trong đầu nhé, vì cả Mục 4 lẫn Mục 5 đều phải phục vụ việc trả lời câu hỏi nghiên cứu.</w:t>
       </w:r>
     </w:p>
     <w:p>
@@ -2623,15 +2623,15 @@
         <w:spacing w:after="160"/>
       </w:pPr>
       <w:r>
-        <w:t>Mục 5 là phương pháp nghiên cứu, cũng là mục dài và nặng nhất của phần thiết kế, với bốn nội dung bắt buộc như trên slide. Thầy muốn các em hiểu vì sao cần đủ cả bốn.</w:t>
-      </w:r>
-    </w:p>
-    <w:p>
-      <w:pPr>
-        <w:spacing w:after="160"/>
-      </w:pPr>
-      <w:r>
-        <w:t>Nội dung thứ nhất là tính phù hợp của phương pháp. Không phải cứ nêu tên phương pháp là xong, mà các em phải giải thích được vì sao phương pháp này trả lời được câu hỏi ở Mục 3. Sau đó, nội dung thứ hai và thứ ba trả lời chuyện làm cụ thể: khảo sát ai, bao nhiêu người, đo những biến nào, đo bằng cách nào, số liệu thứ cấp hay sơ cấp, chọn mẫu và thu thập ra sao. Cuối cùng, nội dung thứ tư mô tả số liệu sẽ được xử lý và phân tích qua những bước nào, kể cả các bước kiểm định giả thuyết nếu đề tài có dùng.</w:t>
+        <w:t>Mục 5 là phương pháp nghiên cứu, cũng là mục dài và nặng nhất của phần thiết kế nghiên cứu, tức phần mô tả mình sẽ tiến hành nghiên cứu như thế nào, với bốn nội dung bắt buộc như trên slide. Thầy muốn các em hiểu vì sao cần đủ cả bốn.</w:t>
+      </w:r>
+    </w:p>
+    <w:p>
+      <w:pPr>
+        <w:spacing w:after="160"/>
+      </w:pPr>
+      <w:r>
+        <w:t>Nội dung thứ nhất là tính phù hợp của phương pháp. Không phải cứ nêu tên phương pháp là xong, mà các em phải giải thích được vì sao phương pháp này trả lời được câu hỏi ở Mục 3. Sau đó, nội dung thứ hai và thứ ba mô tả cách làm cụ thể: khảo sát ai, bao nhiêu người, đo những biến nào, đo bằng cách nào, số liệu thứ cấp hay sơ cấp, chọn mẫu và thu thập ra sao. Cuối cùng, nội dung thứ tư mô tả số liệu sẽ được xử lý và phân tích qua những bước nào, kể cả các bước kiểm định giả thuyết nếu đề tài có dùng.</w:t>
       </w:r>
     </w:p>
     <w:p>
@@ -2647,7 +2647,7 @@
         <w:spacing w:after="160"/>
       </w:pPr>
       <w:r>
-        <w:t>Ví dụ rất đơn giản, giả sử có bạn viết Mục 5 đúng một câu: "Đề tài khảo sát bằng bảng hỏi và phân tích bằng phần mềm SPSS." Các em thử đem câu đó soi vào bốn nội dung thì sẽ thấy nó không nói phương pháp phù hợp ở chỗ nào, không nói mẫu bao nhiêu người, không nói biến nào đo bằng thang gì, cũng không nói phân tích qua những bước nào. Tức là chỉ một câu mà thiếu cả bốn. Kết quả thường là đề cương bị trả lại, bổ sung được phần này thì lại thiếu phần kia, rồi lại bị trả, cứ thế qua vài vòng.</w:t>
+        <w:t>Ví dụ rất đơn giản, giả sử có bạn viết Mục 5 đúng một câu: "Đề tài khảo sát bằng bảng hỏi và phân tích bằng phần mềm SPSS." Các em thử đối chiếu câu đó với bốn nội dung bắt buộc thì sẽ thấy câu này không nói phương pháp phù hợp ở chỗ nào, không nói mẫu bao nhiêu người, không nói biến nào đo bằng thang gì, cũng không nói phân tích qua những bước nào. Tức là chỉ một câu mà thiếu cả bốn. Kết quả thường là đề cương bị trả lại, bổ sung được phần này thì lại thiếu phần kia, rồi lại bị trả, cứ thế qua vài vòng.</w:t>
       </w:r>
     </w:p>
     <w:p>
@@ -2693,7 +2693,7 @@
         <w:spacing w:after="160"/>
       </w:pPr>
       <w:r>
-        <w:t>Ở đây các em cần hiểu một chuyện: Mục 6 không phải danh sách những việc mình định làm, mà phải bám vào mục tiêu. Với mỗi nội dung ghi ra, các em thử hỏi lại một câu là nội dung này phục vụ mục tiêu nào. Nếu không trả lời được thì hoặc là nội dung đó đang đi lạc, hoặc là mục tiêu đang bị thiếu.</w:t>
+        <w:t>Ở đây các em cần hiểu một chuyện: Mục 6 không phải danh sách những việc mình định làm, mà phải bám vào mục tiêu. Với mỗi nội dung ghi ra, các em thử hỏi lại một câu là nội dung này phục vụ mục tiêu nào. Nếu không trả lời được thì có hai khả năng: hoặc nội dung đó không phục vụ mục tiêu nào nên cần bỏ đi, hoặc đó là việc cần thiết mà các em chưa đặt thành mục tiêu nên phải bổ sung vào Mục 2.</w:t>
       </w:r>
     </w:p>
     <w:p>
@@ -2752,7 +2752,7 @@
         <w:spacing w:after="160"/>
       </w:pPr>
       <w:r>
-        <w:t>Mục 8 làm một việc là tổng hợp có phê phán các nghiên cứu liên quan, để làm nền cho mục tiêu và câu hỏi nghiên cứu mà các em đã đặt ở phía trước. Nếu ngành của các em yêu cầu chỉ ra khoảng trống tri thức, tức research gap, thì đây chính là chỗ trình bày khoảng trống đó.</w:t>
+        <w:t>Mục 8 làm một việc là tổng hợp có phê phán các nghiên cứu liên quan, để làm nền cho mục tiêu và câu hỏi nghiên cứu mà các em đã đặt ở Mục 2 và Mục 3. Nếu ngành của các em yêu cầu chỉ ra khoảng trống tri thức, tức research gap, thì đây chính là chỗ trình bày khoảng trống đó.</w:t>
       </w:r>
     </w:p>
     <w:p>
@@ -2784,7 +2784,7 @@
         <w:spacing w:after="160"/>
       </w:pPr>
       <w:r>
-        <w:t>Cách sửa thì không khó. Trước khi viết lại, các em tự hỏi những nghiên cứu mình đã đọc giống nhau ở chỗ nào, khác nhau ở chỗ nào, kết quả có mâu thuẫn nhau không, vì khoảng trống thường nằm ngay ở chỗ khác nhau đó. Sau đó, mỗi đoạn các em viết nên kết thúc bằng một nhận định so sánh, chỉ ra nghiên cứu trước còn thiếu gì. Viết theo cách này, bài thường ngắn lại mà rõ hơn hẳn, có khi mười lăm trang tóm tắt rút lại chỉ còn năm trang nhưng năm trang đó có lập luận.</w:t>
+        <w:t>Cách sửa thì không khó. Trước khi viết lại, các em tự hỏi những nghiên cứu mình đã đọc giống nhau ở chỗ nào, khác nhau ở chỗ nào, kết quả có mâu thuẫn nhau không, vì khoảng trống tri thức thường nằm ở những điểm mà các nghiên cứu cho kết quả khác nhau hoặc ở những khía cạnh chưa ai nghiên cứu tới. Sau đó, mỗi đoạn các em viết nên kết thúc bằng một nhận định so sánh, chỉ ra nghiên cứu trước còn thiếu gì. Viết theo cách này, phần tổng quan thường ngắn lại mà rõ hơn hẳn, có khi mười lăm trang tóm tắt rút lại chỉ còn năm trang nhưng năm trang đó có lập luận.</w:t>
       </w:r>
     </w:p>
     <w:p>
@@ -2798,7 +2798,7 @@
         <w:rPr>
           <w:b/>
         </w:rPr>
-        <w:t>tổng quan không phải kể lại người khác đã nói gì, mà là dùng những gì người khác đã nói để chỉ ra chỗ mình sẽ bước vào.</w:t>
+        <w:t>tổng quan không phải kể lại người khác đã nói gì, mà là dùng những gì người khác đã nói để chỉ ra khoảng trống mà nghiên cứu của mình sẽ lấp vào.</w:t>
       </w:r>
     </w:p>
     <w:p>
@@ -2886,7 +2886,7 @@
         <w:spacing w:after="160"/>
       </w:pPr>
       <w:r>
-        <w:t>Các em để ý là sáu câu này không được xếp ngẫu nhiên. Câu một kiểm tra phần hình thức. Câu hai và câu ba kiểm tra cái mạch đi từ mục tiêu tới câu hỏi rồi tới phương pháp. Còn câu bốn, câu năm và câu sáu kiểm tra ba mục rất dễ bị viết sơ sài là tổng quan, tiến độ và bố cục.</w:t>
+        <w:t>Các em để ý là sáu câu này không được xếp ngẫu nhiên. Câu một kiểm tra phần hình thức. Câu hai và câu ba kiểm tra mục tiêu, câu hỏi và phương pháp có khớp nhau không, tức là phương pháp có trả lời đúng câu hỏi và câu hỏi có bám đúng mục tiêu không. Còn câu bốn, câu năm và câu sáu kiểm tra ba mục rất dễ bị viết sơ sài là tổng quan, tiến độ và bố cục.</w:t>
       </w:r>
     </w:p>
     <w:p>
@@ -2924,34 +2924,34 @@
         <w:spacing w:after="160"/>
       </w:pPr>
       <w:r>
-        <w:t>Cuối Phần năm, mình nhìn Case A được viết thành lời văn thật trong đề cương. Thầy nhắc lại đây là ví dụ sư phạm, không phải số liệu thật và cũng không phải đủ mười mục, thầy chỉ rút ra bốn mục để các em thấy cái mạch.</w:t>
-      </w:r>
-    </w:p>
-    <w:p>
-      <w:pPr>
-        <w:spacing w:after="160"/>
-      </w:pPr>
-      <w:r>
-        <w:t>Các em đọc bốn dòng trên slide liền một hơi sẽ thấy: vấn đề là khách hàng chưa dùng ngân hàng số, nên mục tiêu là tìm xem yếu tố nào ảnh hưởng tới ý định dùng, từ đó câu hỏi là yếu tố nào và vì thế phương pháp là hỏi chính những khách hàng đó rồi dùng hồi quy để đo mức ảnh hưởng. Mỗi dòng sau mọc ra từ dòng trước.</w:t>
-      </w:r>
-    </w:p>
-    <w:p>
-      <w:pPr>
-        <w:spacing w:after="160"/>
-      </w:pPr>
-      <w:r>
-        <w:t>Các em cũng có thể đọc ngược lại, tức là từ phương pháp lần lên câu hỏi, lên mục tiêu rồi lên vấn đề. Nếu đi ngược mà vẫn về đúng chỗ ban đầu thì mạch của các em đang ổn, còn nếu đi ngược mà lạc sang một vấn đề khác thì có một chỗ nào đó đã đứt.</w:t>
-      </w:r>
-    </w:p>
-    <w:p>
-      <w:pPr>
-        <w:spacing w:after="160"/>
-      </w:pPr>
-      <w:r>
-        <w:rPr>
-          <w:b/>
-        </w:rPr>
-        <w:t>Một đề cương tốt không phải là mười mục viết hay, mà là mười mục cùng kể một câu chuyện.</w:t>
+        <w:t>Cuối Phần năm, mình nhìn Case A được viết thành lời văn thật trong đề cương. Thầy nhắc lại đây là ví dụ sư phạm, không phải số liệu thật và cũng không phải đủ mười mục, thầy chỉ rút ra bốn mục để các em thấy các mục nối với nhau như thế nào.</w:t>
+      </w:r>
+    </w:p>
+    <w:p>
+      <w:pPr>
+        <w:spacing w:after="160"/>
+      </w:pPr>
+      <w:r>
+        <w:t>Các em đọc bốn dòng trên slide liền một hơi sẽ thấy: vấn đề là khách hàng chưa dùng ngân hàng số, nên mục tiêu là tìm xem yếu tố nào ảnh hưởng tới ý định dùng, từ đó câu hỏi là yếu tố nào và vì thế phương pháp là hỏi chính những khách hàng đó rồi dùng hồi quy để đo mức ảnh hưởng. Mỗi dòng sau được suy ra trực tiếp từ dòng trước.</w:t>
+      </w:r>
+    </w:p>
+    <w:p>
+      <w:pPr>
+        <w:spacing w:after="160"/>
+      </w:pPr>
+      <w:r>
+        <w:t>Các em cũng có thể đọc ngược lại, tức là từ phương pháp lần lên câu hỏi, lên mục tiêu rồi lên vấn đề. Nếu đi ngược mà vẫn về đúng vấn đề ban đầu thì bốn mục đang khớp nhau, còn nếu đi ngược mà lạc sang một vấn đề khác thì có một mục đã bị lệch khỏi vấn đề và các em cần tìm ra mục đó để sửa.</w:t>
+      </w:r>
+    </w:p>
+    <w:p>
+      <w:pPr>
+        <w:spacing w:after="160"/>
+      </w:pPr>
+      <w:r>
+        <w:rPr>
+          <w:b/>
+        </w:rPr>
+        <w:t>Một đề cương tốt không phải là mười mục viết hay, mà là mười mục cùng hướng về một vấn đề và cùng phục vụ một câu hỏi nghiên cứu.</w:t>
       </w:r>
     </w:p>
     <w:p>
@@ -3104,7 +3104,7 @@
         <w:spacing w:after="160"/>
       </w:pPr>
       <w:r>
-        <w:t>Nửa dưới slide là bốn danh mục mở đầu. Đây không phải cái gì mới mà chính là bốn danh mục ở đề cương, chỉ khác là giờ các em phải cập nhật số trang, số bảng và số hình cho khớp với bản cuối. Có một mẹo nhỏ là các em dùng Heading và chức năng chèn chú thích bảng, hình của Word ngay từ đầu, để tới lúc nộp thì mục lục và các danh mục chỉ cần bấm cập nhật chứ không phải gõ tay lại từng dòng.</w:t>
+        <w:t>Nửa dưới slide là bốn danh mục mở đầu. Đây không phải cái gì mới mà chính là bốn danh mục ở đề cương, chỉ khác là giờ các em phải cập nhật số trang, số bảng và số hình cho khớp với bản khóa luận hoàn chỉnh. Có một mẹo nhỏ là các em dùng Heading và chức năng chèn chú thích bảng, hình của Word ngay từ đầu, để tới lúc nộp thì mục lục và các danh mục chỉ cần bấm cập nhật chứ không phải gõ tay lại từng dòng.</w:t>
       </w:r>
     </w:p>
     <w:p>
@@ -3133,7 +3133,7 @@
         <w:spacing w:after="160"/>
       </w:pPr>
       <w:r>
-        <w:t>Tóm tắt dài khoảng ba trăm từ, viết bằng hai thứ tiếng và phải có đủ năm ý. Con số ba trăm từ chính là cái khung ép các em phải chọn lọc, vì năm ý trong ba trăm từ nghĩa là mỗi ý chỉ được vài câu, không còn chỗ cho dẫn dắt.</w:t>
+        <w:t>Tóm tắt dài khoảng ba trăm từ, viết bằng hai thứ tiếng và phải có đủ năm ý. Con số ba trăm từ chính là cái khung ép các em phải chọn lọc, vì năm ý trong ba trăm từ nghĩa là mỗi ý chỉ được vài câu, không còn chỗ cho những câu dẫn dắt vòng vo.</w:t>
       </w:r>
     </w:p>
     <w:p>
@@ -3158,7 +3158,7 @@
         <w:t>viết tóm tắt sau cùng</w:t>
       </w:r>
       <w:r>
-        <w:t>, khi đã có kết quả thật trong tay. Nếu viết trước thì các em chỉ viết được lời hứa chứ chưa viết được kết quả.</w:t>
+        <w:t>, khi đã có kết quả thật trong tay. Nếu viết trước thì các em chỉ viết được những gì mình dự định làm chứ chưa viết được kết quả đã tìm ra.</w:t>
       </w:r>
     </w:p>
     <w:p>
@@ -3183,7 +3183,7 @@
         <w:t>Nếu sau này phát hiện sai thì người chịu trách nhiệm chính là người đã ký.</w:t>
       </w:r>
       <w:r>
-        <w:t xml:space="preserve"> Dùng một mẫu thống nhất là để cam kết của ai cũng có cùng một nội dung, không ai cam kết lỏng hơn ai.</w:t>
+        <w:t xml:space="preserve"> Dùng một mẫu thống nhất là để cam kết của ai cũng có cùng một nội dung, không ai cam kết ít hơn hay nhẹ hơn người khác.</w:t>
       </w:r>
     </w:p>
     <w:p>
@@ -3212,7 +3212,7 @@
         <w:spacing w:after="160"/>
       </w:pPr>
       <w:r>
-        <w:t>Slide này cho các em cái nhìn từ trên cao về phần nội dung chính, gồm bốn phần lớn, mỗi phần gánh một nhiệm vụ.</w:t>
+        <w:t>Slide này cho các em cái nhìn tổng thể về phần nội dung chính, gồm bốn phần lớn, mỗi phần gánh một nhiệm vụ.</w:t>
       </w:r>
     </w:p>
     <w:p>
@@ -3274,7 +3274,7 @@
         <w:spacing w:after="160"/>
       </w:pPr>
       <w:r>
-        <w:t>Điểm này mới quan trọng: vì sao phải đúng thứ tự? Bởi vì sáu ý này là một chuỗi lập luận. Lý do chọn đề tài dẫn tới mục tiêu, mục tiêu dẫn tới câu hỏi, câu hỏi quyết định phải nghiên cứu ai và ở đâu, rồi sau đó mới tới chuyện dùng phương pháp gì và số liệu nào. Nếu đảo thứ tự thì người đọc sẽ mất dấu ngay.</w:t>
+        <w:t>Điểm này mới quan trọng: vì sao phải đúng thứ tự? Bởi vì sáu ý này là một chuỗi lập luận. Lý do chọn đề tài dẫn tới mục tiêu, mục tiêu dẫn tới câu hỏi, câu hỏi quyết định phải nghiên cứu ai và ở đâu, rồi sau đó mới tới chuyện dùng phương pháp gì và số liệu nào. Nếu đảo thứ tự thì người đọc sẽ không theo kịp lập luận của các em.</w:t>
       </w:r>
     </w:p>
     <w:p>
@@ -3336,15 +3336,15 @@
         <w:spacing w:after="160"/>
       </w:pPr>
       <w:r>
-        <w:t>So với Mục 8 của đề cương, ở đây có thêm một chi tiết là ưu tiên các nghiên cứu công bố trong khoảng năm đến mười năm gần nhất. Lý do là lĩnh vực nào cũng thay đổi, chẳng hạn một nghiên cứu về ngân hàng số từ mười lăm năm trước đã khảo sát một thị trường gần như khác hẳn bây giờ, trong khi khoảng trống các em chỉ ra phải là khoảng trống của hôm nay. Tuy nhiên ưu tiên không có nghĩa là loại bỏ, vì lý thuyết nền và các nghiên cứu kinh điển vẫn phải có mặt, đó là cái gốc.</w:t>
-      </w:r>
-    </w:p>
-    <w:p>
-      <w:pPr>
-        <w:spacing w:after="160"/>
-      </w:pPr>
-      <w:r>
-        <w:t>Còn về cách viết thì vẫn là chuyện mình đã nói ở Phần năm, tức là không tóm tắt rời rạc. Ở đây thầy cho các em thêm một công cụ rất thực tế. Trước khi viết, các em lập một bảng tổng hợp, trong đó mỗi dòng là một nghiên cứu còn các cột là tác giả, bối cảnh, phương pháp, kết quả chính và hạn chế. Làm xong bảng, các em đọc dọc từng cột. Đọc dọc cột bối cảnh, có thể các em thấy phần lớn nghiên cứu làm ở nước ngoài; đọc dọc cột phương pháp, có thể các em thấy ai cũng dùng một kiểu. Khoảng trống hiện ra từ chính cái đọc dọc đó.</w:t>
+        <w:t>So với Mục 8 của đề cương, ở đây có thêm một chi tiết là ưu tiên các nghiên cứu công bố trong khoảng năm đến mười năm gần nhất. Lý do là lĩnh vực nào cũng thay đổi, chẳng hạn một nghiên cứu về ngân hàng số từ mười lăm năm trước đã khảo sát một thị trường gần như khác hẳn bây giờ, trong khi khoảng trống các em chỉ ra phải là khoảng trống của hôm nay. Tuy nhiên ưu tiên không có nghĩa là loại bỏ, vì lý thuyết nền và các nghiên cứu kinh điển vẫn phải có mặt, bởi đó là nền tảng mà các nghiên cứu mới đều dựa vào.</w:t>
+      </w:r>
+    </w:p>
+    <w:p>
+      <w:pPr>
+        <w:spacing w:after="160"/>
+      </w:pPr>
+      <w:r>
+        <w:t>Còn về cách viết thì vẫn là chuyện mình đã nói ở Phần năm, tức là không tóm tắt rời rạc. Ở đây thầy cho các em thêm một công cụ rất thực tế. Trước khi viết, các em lập một bảng tổng hợp, trong đó mỗi dòng là một nghiên cứu còn các cột là tác giả, bối cảnh, phương pháp, kết quả chính và hạn chế. Làm xong bảng, các em đọc dọc từng cột. Đọc dọc cột bối cảnh, có thể các em thấy phần lớn nghiên cứu làm ở nước ngoài; đọc dọc cột phương pháp, có thể các em thấy ai cũng dùng một kiểu. Chính những điểm chung như vậy, chẳng hạn chưa ai nghiên cứu ở Việt Nam hay chưa ai thử một cách tiếp cận khác, là chỗ khoảng trống tri thức lộ ra.</w:t>
       </w:r>
     </w:p>
     <w:p>
@@ -3358,7 +3358,10 @@
         <w:rPr>
           <w:b/>
         </w:rPr>
-        <w:t>viết tổng quan là viết theo cột, không phải viết theo dòng.</w:t>
+        <w:t>viết tổng quan là viết theo từng khía cạnh để so sánh các nghiên cứu với nhau, không phải viết lần lượt từng nghiên cứu một.</w:t>
+      </w:r>
+      <w:r>
+        <w:t xml:space="preserve"> Đó cũng là lý do thầy bảo các em đọc bảng tổng hợp theo từng cột chứ không đọc lần lượt từng dòng.</w:t>
       </w:r>
     </w:p>
     <w:p>
@@ -3425,7 +3428,7 @@
         <w:spacing w:after="160"/>
       </w:pPr>
       <w:r>
-        <w:t>Khuyến nghị cũng vậy, nó phải mọc ra từ kết quả. Giả sử kết quả cho thấy yếu tố tin cậy ảnh hưởng mạnh nhất thì khuyến nghị sẽ xoay quanh chuyện làm sao tăng niềm tin của khách hàng. Còn nếu khuyến nghị những chuyện mà dữ liệu không hề nói tới thì đó là ý kiến cá nhân chứ không phải khuyến nghị từ nghiên cứu.</w:t>
+        <w:t>Khuyến nghị cũng vậy, nó phải được rút ra trực tiếp từ kết quả. Giả sử kết quả cho thấy yếu tố tin cậy ảnh hưởng mạnh nhất thì khuyến nghị sẽ xoay quanh chuyện làm sao tăng niềm tin của khách hàng. Còn nếu khuyến nghị những chuyện mà dữ liệu không hề nói tới thì đó là ý kiến cá nhân chứ không phải khuyến nghị từ nghiên cứu.</w:t>
       </w:r>
     </w:p>
     <w:p>
@@ -3441,7 +3444,7 @@
         <w:spacing w:after="160"/>
       </w:pPr>
       <w:r>
-        <w:t xml:space="preserve">Với phụ lục, thầy nhấn một điều: phụ lục là nơi để bằng chứng chứ không phải nơi để làm dày bài, mà đã là bằng chứng thì phải khớp với phần chính. Thử hình dung phần phương pháp ghi khảo sát mười hai biến trong khi bảng hỏi đính kèm ở phụ lục chỉ có tám câu. Người chấm thấy chỗ lệch đó thì câu hỏi đầu tiên sẽ là vậy số liệu kia từ đâu ra. </w:t>
+        <w:t xml:space="preserve">Với phụ lục, thầy nhấn một điều: phụ lục là nơi để bằng chứng chứ không phải nơi để làm dày bài, mà đã là bằng chứng thì phải khớp với phần chính. Thử hình dung phần phương pháp ghi khảo sát mười hai biến trong khi bảng hỏi đính kèm ở phụ lục chỉ có tám câu. Người chấm thấy chỗ lệch đó thì câu hỏi đầu tiên sẽ là số liệu của bốn biến còn lại lấy từ đâu ra. </w:t>
       </w:r>
       <w:r>
         <w:rPr>
@@ -3519,7 +3522,7 @@
         <w:spacing w:after="160"/>
       </w:pPr>
       <w:r>
-        <w:t>Hai cách hiểu này khác nhau ở chỗ nào? Nếu nghĩ theo chủ đề thì các em có thể viết Chương 2 mà không cần nhìn Chương 1. Còn nếu nghĩ theo câu hỏi thì các em không thể viết Chương 2 khi chưa biết Chương 1 hỏi gì và chính sợi dây ràng buộc đó giữ cho cả khóa luận liền mạch.</w:t>
+        <w:t>Hai cách hiểu này khác nhau ở chỗ nào? Nếu nghĩ theo chủ đề thì các em có thể viết Chương 2 mà không cần nhìn Chương 1. Còn nếu nghĩ theo câu hỏi thì các em không thể viết Chương 2 khi chưa biết Chương 1 hỏi gì Chính việc chương sau buộc phải dựa vào câu hỏi của chương trước là thứ giữ cho cả khóa luận liền mạch.</w:t>
       </w:r>
     </w:p>
     <w:p>
@@ -3556,15 +3559,15 @@
         <w:spacing w:after="160"/>
       </w:pPr>
       <w:r>
-        <w:t>Chương 1 và Chương 5 là một cặp, một bên hỏi còn một bên trả lời. Chương 2 và Chương 4 là một cặp khác, trong đó Chương 2 nói lý thuyết dự đoán điều gì còn Chương 4 xem dữ liệu có đồng ý với dự đoán đó hay không. Chương 3 đứng ở giữa, đóng vai cây cầu nối lý thuyết với dữ liệu. Nhìn theo cặp như vậy thì các em sẽ hiểu vì sao Chương 4 phải so sánh với Chương 2 và vì sao Chương 5 phải quay về đúng câu hỏi của Chương 1.</w:t>
-      </w:r>
-    </w:p>
-    <w:p>
-      <w:pPr>
-        <w:spacing w:after="160"/>
-      </w:pPr>
-      <w:r>
-        <w:t>Slide có một câu mà thầy muốn các em nhớ kỹ: khóa luận yếu thường không phải vì có chương nào viết dở, mà vì năm chương viết tốt riêng lẻ nhưng không nối được với nhau. Lỗi hay gặp nhất là Chương 1 hỏi một đằng trong khi Chương 4 phân tích một nẻo, nên đọc từng chương thì thấy ổn còn đọc liền thì bị đứt.</w:t>
+        <w:t>Chương 1 và Chương 5 là một cặp, một bên hỏi còn một bên trả lời. Chương 2 và Chương 4 là một cặp khác, trong đó Chương 2 nói lý thuyết dự đoán điều gì còn Chương 4 xem dữ liệu có đồng ý với dự đoán đó hay không. Chương 3 đứng ở giữa, đóng vai cây cầu nối lý thuyết với dữ liệu, bởi vì Chương 3 biến những yếu tố trong lý thuyết thành những biến đo được rồi thu dữ liệu cho các biến đó. Nhìn theo cặp như vậy thì các em sẽ hiểu vì sao Chương 4 phải so sánh với Chương 2 và vì sao Chương 5 phải quay về đúng câu hỏi của Chương 1.</w:t>
+      </w:r>
+    </w:p>
+    <w:p>
+      <w:pPr>
+        <w:spacing w:after="160"/>
+      </w:pPr>
+      <w:r>
+        <w:t>Slide có một câu mà thầy muốn các em nhớ kỹ: khóa luận yếu thường không phải vì có chương nào viết dở, mà vì năm chương viết tốt riêng lẻ nhưng không nối được với nhau. Lỗi hay gặp nhất là Chương 1 hỏi một đằng trong khi Chương 4 phân tích một nẻo, nên đọc từng chương thì thấy ổn, còn đọc liền từ đầu tới cuối thì thấy câu trả lời không khớp với câu hỏi.</w:t>
       </w:r>
     </w:p>
     <w:p>
@@ -3578,15 +3581,15 @@
         <w:rPr>
           <w:b/>
         </w:rPr>
-        <w:t>các em đọc câu hỏi nghiên cứu ở Chương 1 rồi lật thẳng sang Chương 5. Nếu Chương 5 trả lời đúng câu đó thì mạch đang ổn, còn nếu không thì có chỗ đứt ở giữa.</w:t>
-      </w:r>
-    </w:p>
-    <w:p>
-      <w:pPr>
-        <w:spacing w:after="160"/>
-      </w:pPr>
-      <w:r>
-        <w:t>Riêng số chương cụ thể thì như slide ghi, các em thống nhất với giảng viên hướng dẫn, vì năm chương ở đây là cái khung để hiểu mạch lý luận.</w:t>
+        <w:t>các em đọc câu hỏi nghiên cứu ở Chương 1 rồi lật thẳng sang Chương 5. Nếu Chương 5 trả lời đúng câu đó thì năm chương đang nối đúng, còn nếu không thì có một chương ở giữa đã đi lệch khỏi câu hỏi ban đầu.</w:t>
+      </w:r>
+    </w:p>
+    <w:p>
+      <w:pPr>
+        <w:spacing w:after="160"/>
+      </w:pPr>
+      <w:r>
+        <w:t>Riêng số chương cụ thể thì như slide ghi, các em thống nhất với giảng viên hướng dẫn, vì năm chương ở đây là cái khung giúp các em hiểu cách các chương nối tiếp nhau.</w:t>
       </w:r>
     </w:p>
     <w:p>
@@ -3623,7 +3626,7 @@
         <w:spacing w:after="160"/>
       </w:pPr>
       <w:r>
-        <w:t>Vì vậy lỗi thường gặp nhất ở chương này là nêu vấn đề chung chung. Ví dụ rất đơn giản: "Tìm hiểu hành vi tiêu dùng của giới trẻ." Câu này không cho biết giới trẻ nào, ở đâu, tiêu dùng cái gì, nên phải hỏi tới đâu thì bạn viết mới thu hẹp dần tới đó. Cuối cùng hóa ra cái bạn đó thật sự muốn nghiên cứu là sinh viên năm cuối của một trường cụ thể mua sắm trên các sàn thương mại điện tử. Đó mới là vấn đề nghiên cứu và lẽ ra nó phải được viết ra ngay từ đầu.</w:t>
+        <w:t>Vì vậy lỗi thường gặp nhất ở chương này là nêu vấn đề chung chung. Ví dụ rất đơn giản: "Tìm hiểu hành vi tiêu dùng của giới trẻ." Câu này không cho biết giới trẻ là ai, ở đâu và tiêu dùng sản phẩm gì, nên người hướng dẫn phải hỏi lại từng điểm một. Qua mỗi câu hỏi, bạn viết mới thu hẹp dần đối tượng và phạm vi nghiên cứu: từ "giới trẻ" thu lại thành sinh viên năm cuối, từ chỗ không rõ ở đâu thu lại thành một trường đại học cụ thể, từ "tiêu dùng" nói chung thu lại thành mua sắm trên các sàn thương mại điện tử. Tới lúc đó vấn đề nghiên cứu mới hiện ra rõ ràng và lẽ ra nó phải được viết như vậy ngay từ đầu.</w:t>
       </w:r>
     </w:p>
     <w:p>
@@ -3637,15 +3640,15 @@
         <w:rPr>
           <w:b/>
         </w:rPr>
-        <w:t>lấy câu vấn đề của mình gắn thử vào một đề tài khác cùng lĩnh vực, nếu nó vẫn đúng thì câu đó còn quá chung.</w:t>
-      </w:r>
-    </w:p>
-    <w:p>
-      <w:pPr>
-        <w:spacing w:after="160"/>
-      </w:pPr>
-      <w:r>
-        <w:t>Chuyện này quan trọng bởi vì Chương 2 sẽ đi tìm lý thuyết để trả lời câu hỏi của Chương 1. Câu hỏi mơ hồ thì Chương 2 không biết phải tìm lý thuyết gì và cái mơ hồ ở Chương 1 sẽ lan xuống tất cả các chương sau.</w:t>
+        <w:t>lấy câu vấn đề của mình đặt thử vào một đề tài khác cùng lĩnh vực, nếu câu đó vẫn dùng được cho đề tài kia thì nó còn quá chung.</w:t>
+      </w:r>
+    </w:p>
+    <w:p>
+      <w:pPr>
+        <w:spacing w:after="160"/>
+      </w:pPr>
+      <w:r>
+        <w:t>Chuyện này quan trọng bởi vì Chương 2 sẽ đi tìm lý thuyết để trả lời câu hỏi của Chương 1. Câu hỏi mơ hồ thì Chương 2 không biết phải tìm lý thuyết gì Rồi sự mơ hồ đó kéo theo lý thuyết mơ hồ ở Chương 2, bảng hỏi mơ hồ ở Chương 3 và cứ thế tới tận kết luận.</w:t>
       </w:r>
     </w:p>
     <w:p>
@@ -3699,15 +3702,15 @@
         <w:spacing w:after="160"/>
       </w:pPr>
       <w:r>
-        <w:t>Tiếp đó, mô hình này sẽ quyết định Chương 3. Mô hình có ba yếu tố thì Chương 3 phải đo đủ ba yếu tố, không thiếu mà cũng không thừa và đây chính là chỗ Chương 2 nối xuống Chương 3.</w:t>
-      </w:r>
-    </w:p>
-    <w:p>
-      <w:pPr>
-        <w:spacing w:after="160"/>
-      </w:pPr>
-      <w:r>
-        <w:t>Lỗi thường gặp thì các em đã nghe ở Mục 8 đề cương, đó là liệt kê từng nghiên cứu mà không so sánh. Thầy chỉ nói thêm một ý: tổng hợp có chọn lọc nghĩa là nhóm các nghiên cứu lại, theo chủ đề hoặc theo kết quả, để thấy nhóm nào đồng thuận và nhóm nào còn tranh cãi. Khoảng trống thường nằm ngay ở chỗ còn tranh cãi hoặc ở chỗ chưa ai làm và bảng tổng hợp đọc theo cột mà thầy nói ở Phần sáu chính là công cụ cho việc này.</w:t>
+        <w:t>Tiếp đó, mô hình này sẽ quyết định Chương 3. Mô hình có ba yếu tố thì Chương 3 phải đo đủ ba yếu tố, không thiếu mà cũng không thừa. Đó chính là cách Chương 2 quyết định nội dung của Chương 3.</w:t>
+      </w:r>
+    </w:p>
+    <w:p>
+      <w:pPr>
+        <w:spacing w:after="160"/>
+      </w:pPr>
+      <w:r>
+        <w:t>Lỗi thường gặp thì các em đã nghe ở Mục 8 đề cương, đó là liệt kê từng nghiên cứu mà không so sánh. Thầy chỉ nói thêm một ý: tổng hợp có chọn lọc nghĩa là nhóm các nghiên cứu lại, theo chủ đề hoặc theo kết quả, để thấy nhóm nào đồng thuận và nhóm nào còn tranh cãi. Khoảng trống thường nằm ngay ở chỗ còn tranh cãi hoặc ở chỗ chưa ai làm Bảng tổng hợp nghiên cứu mà thầy nói ở Phần sáu, tức bảng mỗi dòng một nghiên cứu và đọc dọc theo từng cột, chính là công cụ cho việc này.</w:t>
       </w:r>
     </w:p>
     <w:p>
@@ -3798,15 +3801,15 @@
         <w:spacing w:after="160"/>
       </w:pPr>
       <w:r>
-        <w:t>Ở đây các em cần hiểu một chuyện: phần mềm nào cũng xuất ra được bảng nhưng cái phần mềm không làm được là trả lời câu hỏi "vậy thì sao". Đó là việc của người nghiên cứu.</w:t>
-      </w:r>
-    </w:p>
-    <w:p>
-      <w:pPr>
-        <w:spacing w:after="160"/>
-      </w:pPr>
-      <w:r>
-        <w:t>Vì vậy thầy gợi ý các em diễn giải mỗi bảng qua ba tầng. Tầng thứ nhất là con số nói gì, tức yếu tố nào có tác động, mạnh hay yếu, có ý nghĩa thống kê hay không. Tầng thứ hai là điều đó có nghĩa gì đối với câu hỏi nghiên cứu. Tầng thứ ba là nó có khớp với điều Chương 2 đã dự đoán không và có giống các nghiên cứu trước không.</w:t>
+        <w:t>Ở đây các em cần hiểu một chuyện: phần mềm nào cũng xuất ra được bảng nhưng cái phần mềm không làm được là trả lời câu hỏi "vậy thì sao". Việc giải thích con số đó có ý nghĩa gì với câu hỏi nghiên cứu là việc của người nghiên cứu.</w:t>
+      </w:r>
+    </w:p>
+    <w:p>
+      <w:pPr>
+        <w:spacing w:after="160"/>
+      </w:pPr>
+      <w:r>
+        <w:t>Vì vậy thầy gợi ý các em diễn giải mỗi bảng qua ba tầng. Tầng thứ nhất là con số nói gì, tức yếu tố nào có tác động, mạnh hay yếu, có ý nghĩa thống kê hay không. Tầng thứ hai là điều đó có nghĩa gì đối với câu hỏi nghiên cứu. Tầng thứ ba là kết quả đó có khớp với điều Chương 2 đã dự đoán không và có giống các nghiên cứu trước không.</w:t>
       </w:r>
     </w:p>
     <w:p>
@@ -3857,7 +3860,7 @@
         <w:spacing w:after="160"/>
       </w:pPr>
       <w:r>
-        <w:t>Chương 5 trả lời câu hỏi nhìn lại câu hỏi ở Chương 1 thì nghiên cứu này đã trả lời được gì. Đây là điểm khép vòng của cả khóa luận, nên Chương 1 hỏi ba câu thì Chương 5 phải trả lời đủ ba câu.</w:t>
+        <w:t>Chương 5 quay lại câu hỏi đã đặt ở Chương 1 và trả lời xem nghiên cứu này đã tìm ra được gì. Đây là điểm khép lại vòng lập luận bắt đầu từ Chương 1, nên Chương 1 hỏi ba câu thì Chương 5 phải trả lời đủ ba câu.</w:t>
       </w:r>
     </w:p>
     <w:p>
@@ -3873,7 +3876,7 @@
         <w:spacing w:after="160"/>
       </w:pPr>
       <w:r>
-        <w:t>Lỗi thường gặp trên slide là lỗi thầy muốn các em cảnh giác nhất: đưa ra kết luận vượt ra ngoài phạm vi dữ liệu. Các em còn nhớ bước tám trong trình tự tư duy ở Phần hai chứ, kết luận chỉ được nằm trong phạm vi mà bằng chứng cho phép. Chương 5 chính là chỗ bước tám bị thử thách nhiều nhất, bởi vì viết tới cuối thì người ta rất dễ muốn nói to hơn dữ liệu.</w:t>
+        <w:t>Lỗi thường gặp trên slide là lỗi thầy muốn các em cảnh giác nhất: đưa ra kết luận vượt ra ngoài phạm vi dữ liệu. Các em còn nhớ bước tám trong trình tự tư duy ở Phần hai chứ, kết luận chỉ được nằm trong phạm vi mà bằng chứng cho phép. Chương 5 chính là chỗ bước tám bị thử thách nhiều nhất, bởi vì viết tới cuối thì người ta rất dễ muốn kết luận rộng hơn những gì dữ liệu cho phép.</w:t>
       </w:r>
     </w:p>
     <w:p>
@@ -3898,7 +3901,7 @@
         <w:spacing w:after="160"/>
       </w:pPr>
       <w:r>
-        <w:t>Vậy nếu muốn nói rộng hơn thì để ở đâu? Các em để nó ở phần hạn chế và hướng nghiên cứu tiếp theo, chẳng hạn: nghiên cứu mới dừng ở một thành phố, nên nghiên cứu sau có thể mở rộng ra các khu vực khác để kiểm chứng. Nói như vậy vừa trung thực vừa cho thấy các em biết đường đi tiếp.</w:t>
+        <w:t>Vậy nếu muốn nói rộng hơn thì để ở đâu? Các em đưa những nhận định rộng hơn đó vào phần hạn chế và hướng nghiên cứu tiếp theo, chẳng hạn: nghiên cứu mới dừng ở một thành phố, nên nghiên cứu sau có thể mở rộng ra các khu vực khác để kiểm chứng. Nói như vậy vừa trung thực vừa cho thấy các em biết nghiên cứu tiếp theo nên làm gì.</w:t>
       </w:r>
     </w:p>
     <w:p>
@@ -4002,18 +4005,18 @@
         <w:rPr>
           <w:b/>
         </w:rPr>
-        <w:t>Mỗi trích dẫn là một viên gạch bằng chứng.</w:t>
-      </w:r>
-      <w:r>
-        <w:t xml:space="preserve"> Chẳng hạn các em viết "yếu tố tin cậy ảnh hưởng tới ý định sử dụng" mà không có nguồn thì đó chỉ là ý kiến của các em, còn có nguồn thì nó trở thành một nhận định có cơ sở. Nói cách khác, trích dẫn làm lập luận của các em mạnh lên.</w:t>
-      </w:r>
-    </w:p>
-    <w:p>
-      <w:pPr>
-        <w:spacing w:after="160"/>
-      </w:pPr>
-      <w:r>
-        <w:t>Core Slide 1 chỉ đi phần nguyên tắc, còn bảng tra cứu từng loại tài liệu được để dành cho Core Slide 2.</w:t>
+        <w:t>Mỗi trích dẫn là một bằng chứng đỡ cho lập luận của các em</w:t>
+      </w:r>
+      <w:r>
+        <w:t>, giống như từng viên gạch xây nên bức tường. Chẳng hạn các em viết "yếu tố tin cậy ảnh hưởng tới ý định sử dụng" mà không có nguồn thì đó chỉ là ý kiến của các em, còn có nguồn thì nó trở thành một nhận định có cơ sở. Nói cách khác, trích dẫn làm lập luận của các em mạnh lên.</w:t>
+      </w:r>
+    </w:p>
+    <w:p>
+      <w:pPr>
+        <w:spacing w:after="160"/>
+      </w:pPr>
+      <w:r>
+        <w:t>Core Slide 1 chỉ trình bày phần nguyên tắc, còn bảng tra cứu từng loại tài liệu được để dành cho Core Slide 2.</w:t>
       </w:r>
     </w:p>
     <w:p>
@@ -4109,7 +4112,7 @@
         <w:spacing w:after="160"/>
       </w:pPr>
       <w:r>
-        <w:t xml:space="preserve">Vì sao lại chặt như vậy? Bởi vì danh mục là để người đọc đi kiểm chứng. Họ thấy một trích dẫn trong bài thì lật ra cuối để tìm nguồn, không thấy là mất dấu. Ngược lại, họ thấy một tài liệu trong danh mục mà trong bài không hề nhắc tới thì sẽ tự hỏi tài liệu này được dùng vào đâu. </w:t>
+        <w:t xml:space="preserve">Vì sao lại chặt như vậy? Bởi vì danh mục là để người đọc đi kiểm chứng. Họ thấy một trích dẫn trong bài thì lật ra cuối để tìm nguồn, nếu không tìm thấy thì họ không kiểm chứng được nhận định đó. Ngược lại, họ thấy một tài liệu trong danh mục mà trong bài không hề nhắc tới thì sẽ tự hỏi tài liệu này được dùng vào đâu. </w:t>
       </w:r>
       <w:r>
         <w:rPr>
@@ -4131,7 +4134,7 @@
         <w:spacing w:after="160"/>
       </w:pPr>
       <w:r>
-        <w:t>Phụ lục thì có chức năng khác. Phụ lục chứa những thứ chi tiết mà nếu đặt vào thân bài sẽ làm đứt mạch đọc, nên người đọc cần thì lật ra xem, còn không cần thì mạch chính vẫn trôi.</w:t>
+        <w:t>Phụ lục thì có chức năng khác. Phụ lục chứa những thứ chi tiết mà nếu đặt vào thân bài sẽ làm người đọc bị ngắt khỏi lập luận chính. Để ở phụ lục thì ai cần kiểm tra chi tiết sẽ lật ra xem, còn người đọc thân bài vẫn theo dõi được lập luận liền mạch.</w:t>
       </w:r>
     </w:p>
     <w:p>
@@ -4354,7 +4357,7 @@
         <w:spacing w:after="160"/>
       </w:pPr>
       <w:r>
-        <w:t>Phần chín nói về format và thầy nói thẳng trước một điều để các em đặt format vào đúng chỗ của nó: format không cứu được một bài yếu nhưng format lộn xộn có thể làm một bài tốt bị đánh giá thấp hơn thực chất.</w:t>
+        <w:t>Phần chín nói về format và thầy nói thẳng trước một điều để các em hiểu đúng vai trò của format: format không cứu được một bài yếu nhưng format lộn xộn có thể làm một bài tốt bị đánh giá thấp hơn thực chất.</w:t>
       </w:r>
     </w:p>
     <w:p>
@@ -4376,10 +4379,10 @@
         <w:rPr>
           <w:b/>
         </w:rPr>
-        <w:t>format tốt là format mà người đọc không phải để ý tới.</w:t>
-      </w:r>
-      <w:r>
-        <w:t xml:space="preserve"> Trong hai câu hỏi trên slide, câu thứ hai là câu thầy muốn các em để tâm nhất, đó là chuẩn bị ngay từ đầu.</w:t>
+        <w:t>format tốt là format mà người đọc không phải để ý tới</w:t>
+      </w:r>
+      <w:r>
+        <w:t>, tức là trình bày thống nhất tới mức người đọc chỉ còn tập trung vào nội dung. Trong hai câu hỏi trên slide, câu thứ hai là câu thầy muốn các em để tâm nhất, đó là chuẩn bị ngay từ đầu.</w:t>
       </w:r>
     </w:p>
     <w:p>
@@ -4558,23 +4561,23 @@
         <w:spacing w:after="160"/>
       </w:pPr>
       <w:r>
-        <w:t>Slide này nói về cách đánh số đề mục và ví dụ 3.2.3.1 trên slide đã chỉ rõ cách đếm. Thầy chỉ dừng ở nguyên tắc quan trọng nhất: có 1.1.1 thì phải có 1.1.2, tức là không chia ra được ít nhất hai đề mục con thì đừng chia.</w:t>
-      </w:r>
-    </w:p>
-    <w:p>
-      <w:pPr>
-        <w:spacing w:after="160"/>
-      </w:pPr>
-      <w:r>
-        <w:t>Lý do là chia có nghĩa là tách một cái thành nhiều phần, nên chỉ có một phần thì không phải là chia. Một đề mục con đứng một mình thì nội dung của nó chính là nội dung của đề mục cha, vì vậy gộp thẳng vào đề mục cha là xong.</w:t>
-      </w:r>
-    </w:p>
-    <w:p>
-      <w:pPr>
-        <w:spacing w:after="160"/>
-      </w:pPr>
-      <w:r>
-        <w:t xml:space="preserve">Liên quan tới chuyện này, các em còn hay gặp lỗi chia quá vụn, một đoạn chỉ vài dòng mà cũng có tới đề mục bốn cấp. Nhìn cấu trúc thì tưởng rất chi tiết nhưng đọc vào lại thấy rời rạc. </w:t>
+        <w:t>Slide này nói về cách đánh số đề mục và ví dụ 3.2.3.1 trên slide đã chỉ rõ cách đọc từng con số. Thầy chỉ dừng ở nguyên tắc quan trọng nhất: có 1.1.1 thì phải có 1.1.2, tức là không chia ra được ít nhất hai đề mục con thì đừng chia.</w:t>
+      </w:r>
+    </w:p>
+    <w:p>
+      <w:pPr>
+        <w:spacing w:after="160"/>
+      </w:pPr>
+      <w:r>
+        <w:t>Lý do là chia có nghĩa là tách một đề mục thành nhiều phần, nên chỉ có một phần thì không phải là chia. Một đề mục con đứng một mình thì nội dung của nó chính là nội dung của đề mục cha, vì vậy gộp thẳng vào đề mục cha là xong.</w:t>
+      </w:r>
+    </w:p>
+    <w:p>
+      <w:pPr>
+        <w:spacing w:after="160"/>
+      </w:pPr>
+      <w:r>
+        <w:t xml:space="preserve">Liên quan tới việc chia đề mục, các em còn hay gặp lỗi chia quá vụn, một đoạn chỉ vài dòng mà cũng có tới đề mục bốn cấp. Nhìn cấu trúc thì tưởng rất chi tiết nhưng đọc vào lại thấy rời rạc. </w:t>
       </w:r>
       <w:r>
         <w:rPr>
@@ -4588,7 +4591,7 @@
         <w:spacing w:after="160"/>
       </w:pPr>
       <w:r>
-        <w:t>Slide còn nhắc tới kết luận chương, phần làm hai việc là gói lại ý chính của chương và mở ra chương sau. Vì vậy các em đừng chép lại đoạn giới thiệu ở đầu chương, bởi vì giới thiệu nói chương này sẽ làm gì, còn kết luận nói chương này đã tìm ra gì và do đó chương sau cần làm gì. Đó cũng chính là mạch năm chương ở Phần bảy, được thể hiện ra ở từng chương một.</w:t>
+        <w:t>Slide còn nhắc tới kết luận chương, phần làm hai việc là gói lại ý chính của chương và mở ra chương sau. Vì vậy các em đừng chép lại đoạn giới thiệu ở đầu chương, bởi vì giới thiệu nói chương này sẽ làm gì, còn kết luận nói chương này đã tìm ra gì và do đó chương sau cần làm gì. Viết kết luận chương như vậy cũng chính là cách các chương nối tiếp nhau như mình đã nói ở Phần bảy.</w:t>
       </w:r>
     </w:p>
     <w:p>
@@ -4625,7 +4628,7 @@
         <w:spacing w:after="160"/>
       </w:pPr>
       <w:r>
-        <w:t>Với công thức, các em phải giải thích đủ từng ký hiệu, bởi vì người đọc không ở trong đầu các em, nên ký hiệu nào không được giải thích là một chỗ họ phải đoán. Chú thích cuối trang thì chỉ dùng khi thông tin phụ mà đặt vào đoạn văn sẽ làm đứt mạch, đừng biến nó thành chỗ viết thêm. Còn chữ viết tắt thì lần đầu viết đủ kèm chữ tắt, từ lần sau mới dùng dạng tắt và tất cả được đưa vào danh mục từ viết tắt ở đầu bài, đúng cái danh mục các em đã làm từ đề cương.</w:t>
+        <w:t>Với công thức, các em phải giải thích đủ từng ký hiệu, bởi vì người đọc không biết các em đã quy ước ký hiệu đó như thế nào, nên ký hiệu nào không được giải thích là một chỗ họ phải đoán. Chú thích cuối trang thì chỉ dùng khi thông tin phụ mà đặt vào đoạn văn sẽ làm câu văn bị ngắt quãng, đừng biến nó thành chỗ viết thêm. Còn chữ viết tắt thì lần đầu viết đủ kèm chữ tắt, từ lần sau mới dùng dạng tắt và tất cả được đưa vào danh mục từ viết tắt ở đầu bài, đúng cái danh mục các em đã làm từ đề cương.</w:t>
       </w:r>
     </w:p>
     <w:p>
@@ -4724,7 +4727,7 @@
         <w:spacing w:after="160"/>
       </w:pPr>
       <w:r>
-        <w:t>Slide này là bốn bước đầu, từ đăng ký đề tài tới viết và chỉnh sửa bản thảo. Các em nhìn cột "Ai thực hiện" trước sẽ thấy nhịp là sinh viên, giảng viên, sinh viên rồi cả hai. Nhịp này cho thấy người chủ động là các em, còn giảng viên hướng dẫn góp ý trên chính cái các em mang tới.</w:t>
+        <w:t>Slide này là bốn bước đầu, từ đăng ký đề tài tới viết và chỉnh sửa bản thảo. Các em nhìn cột "Ai thực hiện" trước sẽ thấy thứ tự là sinh viên, giảng viên, sinh viên rồi cả hai. Thứ tự này cho thấy người chủ động là các em, còn giảng viên hướng dẫn góp ý dựa trên bản đăng ký, bản đề cương hay bản thảo mà các em mang tới.</w:t>
       </w:r>
     </w:p>
     <w:p>
@@ -4740,7 +4743,7 @@
         <w:spacing w:after="160"/>
       </w:pPr>
       <w:r>
-        <w:t xml:space="preserve">Nói cách khác, Bước 2 là chỗ một người có kinh nghiệm nhìn vào đề tài và cho các em biết nó có đi được hay không. </w:t>
+        <w:t xml:space="preserve">Nói cách khác, Bước 2 là chỗ một người có kinh nghiệm nhìn vào đề tài và cho các em biết đề tài có thực hiện được hay không. </w:t>
       </w:r>
       <w:r>
         <w:rPr>
@@ -4851,7 +4854,7 @@
         <w:rPr>
           <w:b/>
         </w:rPr>
-        <w:t>Vì vậy bài phải tự đứng được, không cần ai giải thích hộ.</w:t>
+        <w:t>Vì vậy bài phải tự thuyết phục được người đọc, tức là người đọc chỉ cần đọc bài là hiểu, không cần ai giải thích hộ.</w:t>
       </w:r>
     </w:p>
     <w:p>
@@ -4936,7 +4939,7 @@
         <w:spacing w:after="160"/>
       </w:pPr>
       <w:r>
-        <w:t>Nguyên tắc thứ nhất là bài không được chấm theo số trang. Đủ số trang mới là điều kiện cần chứ chưa phải điều kiện đủ, bởi vì một bài dài mà các phần rời rạc thì độ dài chỉ làm chỗ rời rạc lộ ra rõ hơn.</w:t>
+        <w:t>Nguyên tắc thứ nhất là bài không được chấm theo số trang. Đủ số trang mới là điều kiện cần chứ chưa phải điều kiện đủ, bởi vì một bài dài mà các phần không nối với nhau thì càng dài, người đọc càng thấy rõ sự rời rạc đó.</w:t>
       </w:r>
     </w:p>
     <w:p>
@@ -5001,18 +5004,18 @@
         <w:rPr>
           <w:b/>
         </w:rPr>
-        <w:t>cơ cấu điểm chính là lời nhắn của người làm tiêu chí về việc họ coi trọng cái gì.</w:t>
-      </w:r>
-      <w:r>
-        <w:t xml:space="preserve"> Họ coi trọng việc các em phân tích được thực tế, phát hiện được chỗ bất hợp lý và giải thích được nguyên nhân. Trong cấu trúc năm chương, phần này nằm chủ yếu ở Chương 4, tức chỗ các em diễn giải kết quả.</w:t>
-      </w:r>
-    </w:p>
-    <w:p>
-      <w:pPr>
-        <w:spacing w:after="160"/>
-      </w:pPr>
-      <w:r>
-        <w:t>Vì vậy thời gian của các em cũng nên được phân bổ theo đúng tỷ lệ đó. Thử hình dung một bạn dành phần lớn thời gian để chỉnh font, canh lề và làm bìa thật đẹp, còn phần phân tích thì viết vội trong hai ngày cuối. Bài mở ra trông rất chỉn chu nhưng điểm tổng lại thấp, bởi vì phần nặng điểm nhất lại là phần được đầu tư ít nhất.</w:t>
+        <w:t>cơ cấu điểm cho các em biết người đặt tiêu chí coi trọng phần nào nhất.</w:t>
+      </w:r>
+      <w:r>
+        <w:t xml:space="preserve"> Ở đây họ coi trọng việc các em phân tích được thực tế, phát hiện được chỗ bất hợp lý và giải thích được nguyên nhân. Trong cấu trúc năm chương, phần phân tích thực tiễn này nằm chủ yếu ở Chương 4, tức chỗ các em diễn giải kết quả.</w:t>
+      </w:r>
+    </w:p>
+    <w:p>
+      <w:pPr>
+        <w:spacing w:after="160"/>
+      </w:pPr>
+      <w:r>
+        <w:t>Vì vậy thời gian của các em cũng nên được phân bổ theo tỷ lệ điểm của từng phần. Thử hình dung một bạn dành phần lớn thời gian để chỉnh font, canh lề và làm bìa thật đẹp, còn phần phân tích thì viết vội trong hai ngày cuối. Bài mở ra trông rất chỉn chu nhưng điểm tổng lại thấp, bởi vì phần nặng điểm nhất lại là phần được đầu tư ít nhất.</w:t>
       </w:r>
     </w:p>
     <w:p>
@@ -5173,7 +5176,7 @@
         <w:spacing w:after="160"/>
       </w:pPr>
       <w:r>
-        <w:t>Chỗ thứ nhất là trọng số một trăm phần trăm, nghĩa là không có điểm quá trình nào đỡ cho các em, điểm bài chấm chính là điểm học phần và đi thẳng vào điểm trung bình tích lũy. Chỗ thứ hai là điểm F hoặc F cộng, với hệ quả là phải đăng ký thực hiện lại học phần. Tức là làm lại từ đầu, chứ không phải sửa phần lỗi rồi nộp lại và các em hình dung được cái giá đó là thêm một học kỳ để đi lại toàn bộ hành trình tám tuần.</w:t>
+        <w:t>Chỗ thứ nhất là trọng số một trăm phần trăm, nghĩa là không có điểm quá trình nào để bù vào nếu bài chấm thấp, điểm bài chấm chính là điểm học phần và đi thẳng vào điểm trung bình tích lũy. Chỗ thứ hai là điểm F hoặc F cộng, với hệ quả là phải đăng ký thực hiện lại học phần. Tức là làm lại từ đầu, chứ không phải sửa phần lỗi rồi nộp lại và các em hình dung được cái giá đó là thêm một học kỳ để đi lại toàn bộ hành trình tám tuần.</w:t>
       </w:r>
     </w:p>
     <w:p>
@@ -5224,29 +5227,29 @@
         <w:spacing w:after="160"/>
       </w:pPr>
       <w:r>
-        <w:t xml:space="preserve">Hãy để ý cột bằng chứng, các em sẽ thấy nó đi đúng theo mạch từ Chương 1 xuống Chương 5 và điều đó không phải ngẫu nhiên. </w:t>
-      </w:r>
-      <w:r>
-        <w:rPr>
-          <w:b/>
-        </w:rPr>
-        <w:t>Tiêu chí chấm đi theo đúng mạch năm chương ở Phần bảy, cho nên hiểu được mạch năm chương là đã hiểu được một nửa cách người ta chấm.</w:t>
-      </w:r>
-    </w:p>
-    <w:p>
-      <w:pPr>
-        <w:spacing w:after="160"/>
-      </w:pPr>
-      <w:r>
-        <w:t>Còn cột tự kiểm tra thì nối ngược về những gì mình đã học. Nhóm một đối chiếu với checklist sáu câu ở Phần ba và sơ đồ liên kết ở Phần bốn, còn nhóm bốn chính là bước tám ở Phần hai, tức kết luận phải nằm trong phạm vi bằng chứng.</w:t>
-      </w:r>
-    </w:p>
-    <w:p>
-      <w:pPr>
-        <w:spacing w:after="160"/>
-      </w:pPr>
-      <w:r>
-        <w:t>Thầy lấy nhóm bốn làm ví dụ vì đây là lỗi các em hoàn toàn tự phát hiện được. Thử hình dung phần kết luận viết rằng đa số khách hàng trẻ tại Việt Nam ưu tiên dùng ngân hàng số, trong khi dữ liệu chỉ lấy từ đúng một trường đại học. Cách bắt lỗi là đặt từng câu kết luận cạnh bảng số liệu rồi hỏi câu này dựa trên bảng nào. Nếu không chỉ ra được bảng nào thì câu đó chưa có quyền đứng trong phần kết luận.</w:t>
+        <w:t xml:space="preserve">Hãy để ý cột bằng chứng, các em sẽ thấy bằng chứng của nhóm một nằm ở Chương 1, còn bằng chứng của nhóm bốn nằm ở Chương 3, 4 và 5, tức là bốn nhóm đi lần lượt từ đầu tới cuối khóa luận. Điều đó không phải ngẫu nhiên. </w:t>
+      </w:r>
+      <w:r>
+        <w:rPr>
+          <w:b/>
+        </w:rPr>
+        <w:t>Tiêu chí chấm đi theo đúng thứ tự năm chương ở Phần bảy, cho nên hiểu nhiệm vụ của từng chương thì các em cũng hiểu được phần lớn cách người ta chấm.</w:t>
+      </w:r>
+    </w:p>
+    <w:p>
+      <w:pPr>
+        <w:spacing w:after="160"/>
+      </w:pPr>
+      <w:r>
+        <w:t>Còn cột tự kiểm tra thì dẫn lại những công cụ mình đã học ở các phần trước. Nhóm một đối chiếu với checklist sáu câu ở Phần ba và sơ đồ liên kết ở Phần bốn, còn nhóm bốn chính là bước tám ở Phần hai, tức kết luận phải nằm trong phạm vi bằng chứng.</w:t>
+      </w:r>
+    </w:p>
+    <w:p>
+      <w:pPr>
+        <w:spacing w:after="160"/>
+      </w:pPr>
+      <w:r>
+        <w:t>Thầy lấy nhóm bốn làm ví dụ vì đây là lỗi các em hoàn toàn tự phát hiện được. Thử hình dung phần kết luận viết rằng đa số khách hàng trẻ tại Việt Nam ưu tiên dùng ngân hàng số, trong khi dữ liệu chỉ lấy từ đúng một trường đại học. Cách bắt lỗi là đặt từng câu kết luận cạnh bảng số liệu rồi hỏi câu này dựa trên bảng nào. Nếu không chỉ ra được bảng nào thì câu đó chưa đủ căn cứ để đưa vào phần kết luận.</w:t>
       </w:r>
     </w:p>
     <w:p>
@@ -5283,15 +5286,15 @@
         <w:spacing w:after="160"/>
       </w:pPr>
       <w:r>
-        <w:t>Nhóm năm là khả năng diễn giải kết quả, chính là ba tầng diễn giải thầy đã nói ở Chương 4. Cách tự kiểm tra rất cơ học: các em lật từng bảng xem phía dưới có đoạn giải thích hay không, bảng nào đứng trơ trọi một mình thì đó là bảng chưa xong.</w:t>
-      </w:r>
-    </w:p>
-    <w:p>
-      <w:pPr>
-        <w:spacing w:after="160"/>
-      </w:pPr>
-      <w:r>
-        <w:t>Nhóm sáu và nhóm bảy là hai nhóm kiểm tra được một cách máy móc và mẹo ở đây là tách riêng từng lượt đọc: một lượt chỉ dò trích dẫn với danh mục, một lượt chỉ dò format. Nếu vừa đọc nội dung vừa soát format thì mắt các em sẽ trượt, bởi vì đầu óc đang chạy theo nội dung.</w:t>
+        <w:t>Nhóm năm là khả năng diễn giải kết quả, chính là ba tầng diễn giải thầy đã nói ở Chương 4. Cách tự kiểm tra rất cơ học: các em lật từng bảng xem phía dưới có đoạn giải thích hay không, bảng nào không có đoạn giải thích đi kèm thì bảng đó chưa viết xong.</w:t>
+      </w:r>
+    </w:p>
+    <w:p>
+      <w:pPr>
+        <w:spacing w:after="160"/>
+      </w:pPr>
+      <w:r>
+        <w:t>Nhóm sáu và nhóm bảy là hai nhóm kiểm tra được một cách máy móc và mẹo ở đây là tách riêng từng lượt đọc: một lượt chỉ dò trích dẫn với danh mục, một lượt chỉ dò format. Nếu vừa đọc nội dung vừa soát format thì các em rất dễ bỏ sót lỗi format, bởi vì đầu óc đang tập trung theo dõi nội dung.</w:t>
       </w:r>
     </w:p>
     <w:p>
@@ -5307,7 +5310,7 @@
         <w:spacing w:after="160"/>
       </w:pPr>
       <w:r>
-        <w:t xml:space="preserve">Nhóm tám là khả năng giải thích quyết định và thầy coi đây là nhóm gói tất cả lại. Người chấm muốn biết các em làm như vậy vì hiểu hay chỉ vì thấy người khác cũng làm vậy và câu trả lời lộ ra rõ nhất ở buổi bảo vệ, đúng như thầy đã nói ở Mục 3. </w:t>
+        <w:t xml:space="preserve">Nhóm tám là khả năng giải thích quyết định và thầy coi đây là nhóm tổng hợp, vì mọi lựa chọn ở bảy nhóm trước đều phải giải thích được. Người chấm muốn biết các em làm như vậy vì hiểu hay chỉ vì thấy người khác cũng làm vậy và câu trả lời lộ ra rõ nhất ở buổi bảo vệ, đúng như thầy đã nói ở Mục 3. </w:t>
       </w:r>
       <w:r>
         <w:rPr>
@@ -5342,7 +5345,7 @@
         <w:spacing w:after="160"/>
       </w:pPr>
       <w:r>
-        <w:t>Giờ mình lấy Case A chạy thử qua ba nhóm tiêu chí và đây vẫn là ví dụ sư phạm.</w:t>
+        <w:t>Giờ mình lấy Case A đối chiếu thử với ba nhóm tiêu chí và đây vẫn là ví dụ sư phạm.</w:t>
       </w:r>
     </w:p>
     <w:p>
@@ -5367,15 +5370,15 @@
         <w:t>tự kiểm tra có hiệu quả là biến một tiêu chí mơ hồ thành những câu hỏi có hoặc không.</w:t>
       </w:r>
       <w:r>
-        <w:t xml:space="preserve"> Ba nhóm trên slide chỉ là ví dụ, còn bài thật thì các em phải chạy đủ cả tám nhóm.</w:t>
-      </w:r>
-    </w:p>
-    <w:p>
-      <w:pPr>
-        <w:spacing w:after="160"/>
-      </w:pPr>
-      <w:r>
-        <w:t>Như vậy là xong phần tiêu chí để chấm. Phần mười hai sẽ chuyển sang một công cụ không dùng để chấm mà dùng để đi đường, đó là báo cáo tiến độ hằng tuần.</w:t>
+        <w:t xml:space="preserve"> Ba nhóm trên slide chỉ là ví dụ, còn bài thật thì các em phải tự kiểm tra đủ cả tám nhóm.</w:t>
+      </w:r>
+    </w:p>
+    <w:p>
+      <w:pPr>
+        <w:spacing w:after="160"/>
+      </w:pPr>
+      <w:r>
+        <w:t>Như vậy là xong phần tiêu chí để chấm. Phần mười hai sẽ chuyển sang một công cụ không dùng để chấm mà dùng để theo dõi tiến độ trong suốt quá trình làm bài, đó là báo cáo tiến độ hằng tuần.</w:t>
       </w:r>
     </w:p>
     <w:p>
@@ -5468,15 +5471,15 @@
         <w:spacing w:after="160"/>
       </w:pPr>
       <w:r>
-        <w:t>Các em để ý sự khác biệt giữa hai cách viết. Viết "tuần này em làm được khá nhiều việc" là viết cảm nhận, còn viết "hoàn thành bản thảo mục 2.1 và 2.2 của Chương 2, lập xong bảng tổng hợp mười hai nghiên cứu" là viết sự việc. Đọc cách thứ nhất, người đọc không biết thêm được gì, còn đọc cách thứ hai thì họ biết chính xác các em đang ở đâu.</w:t>
-      </w:r>
-    </w:p>
-    <w:p>
-      <w:pPr>
-        <w:spacing w:after="160"/>
-      </w:pPr>
-      <w:r>
-        <w:t>Mục tiêu của tuần cũng vậy, nó phải được lấy từ timeline đã lập chứ không phải mỗi tuần tự nghĩ ra một mục tiêu mới. Có như vậy thì khi đặt mục tiêu cạnh việc đã làm, các em mới thấy được mức chênh lệch thật.</w:t>
+        <w:t>Các em để ý sự khác biệt giữa hai cách viết. Viết "tuần này em làm được khá nhiều việc" là viết cảm nhận, còn viết "hoàn thành bản thảo mục 2.1 và 2.2 của Chương 2, lập xong bảng tổng hợp mười hai nghiên cứu" là viết sự việc. Đọc cách thứ nhất, người đọc không biết thêm được gì, còn đọc cách thứ hai thì họ biết chính xác các em đang ở bước nào của kế hoạch.</w:t>
+      </w:r>
+    </w:p>
+    <w:p>
+      <w:pPr>
+        <w:spacing w:after="160"/>
+      </w:pPr>
+      <w:r>
+        <w:t>Mục tiêu của tuần cũng vậy, nó phải được lấy từ timeline đã lập chứ không phải mỗi tuần tự nghĩ ra một mục tiêu mới. Có như vậy thì khi đặt mục tiêu cạnh việc đã làm, các em mới thấy được mình đang đúng tiến độ hay đang chậm và chậm bao nhiêu.</w:t>
       </w:r>
     </w:p>
     <w:p>
@@ -5519,7 +5522,7 @@
         <w:spacing w:after="160"/>
       </w:pPr>
       <w:r>
-        <w:t>Thử hình dung một bạn tuần nào cũng ghi mục này là "không có gì đáng kể", tới tuần sáu mới nói thật là từ tuần bốn đã không liên hệ được người tham gia khảo sát. Nếu viết thật ngay từ tuần bốn thì giảng viên có tới hai tuần để cùng tìm cách, chẳng hạn đổi đối tượng, đổi kênh khảo sát hay nhờ người giới thiệu. Còn nếu tới tuần sáu mới nói thì chỉ còn cách dồn ép tiến độ.</w:t>
+        <w:t>Thử hình dung một bạn tuần nào cũng ghi mục này là "không có gì đáng kể", tới tuần sáu mới nói thật là từ tuần bốn đã không liên hệ được người tham gia khảo sát. Nếu viết thật ngay từ tuần bốn thì giảng viên có tới hai tuần để cùng tìm cách, chẳng hạn đổi đối tượng, đổi kênh khảo sát hay nhờ người giới thiệu. Còn nếu tới tuần sáu mới nói thì chỉ còn cách làm dồn trong mấy tuần cuối.</w:t>
       </w:r>
     </w:p>
     <w:p>
@@ -5629,7 +5632,7 @@
         <w:spacing w:after="160"/>
       </w:pPr>
       <w:r>
-        <w:t>Timeline được trình bày qua ba lớp: sơ đồ tám tuần cho biết nhịp chung, bảng sản phẩm theo cặp tuần cho biết cuối mỗi chặng phải có gì trong tay, còn critical path cho biết việc nào tuyệt đối không được trễ.</w:t>
+        <w:t>Timeline được trình bày qua ba lớp: sơ đồ tám tuần cho biết nhịp độ công việc chung của cả tám tuần, bảng sản phẩm theo cặp tuần cho biết cuối mỗi chặng phải có gì trong tay, còn critical path cho biết việc nào tuyệt đối không được trễ.</w:t>
       </w:r>
     </w:p>
     <w:p>
@@ -5675,7 +5678,7 @@
         <w:spacing w:after="160"/>
       </w:pPr>
       <w:r>
-        <w:t>Điều thứ nhất là nhịp độ. Bốn tuần đầu các em làm việc với ý tưởng, gồm chọn đề tài, làm proposal, viết Chương 1 và Chương 2, còn bốn tuần sau thì làm việc với dữ liệu thật, gồm công cụ, thu thập, phân tích và hoàn thiện. Điểm này mới quan trọng: nửa sau phụ thuộc hoàn toàn vào nửa đầu, nên nửa đầu làm chắc thì nửa sau mới chạy được, còn nửa đầu làm lỏng thì nửa sau không có gì vững để dựa vào.</w:t>
+        <w:t>Điều thứ nhất là nhịp độ. Bốn tuần đầu các em làm việc với ý tưởng, gồm chọn đề tài, làm proposal, viết Chương 1 và Chương 2, còn bốn tuần sau thì làm việc với dữ liệu thật, gồm công cụ, thu thập, phân tích và hoàn thiện. Điểm này mới quan trọng: nửa sau phụ thuộc hoàn toàn vào nửa đầu, nên nửa đầu làm chắc thì nửa sau mới triển khai được, còn nửa đầu làm sơ sài thì nửa sau không có gì vững để dựa vào.</w:t>
       </w:r>
     </w:p>
     <w:p>
@@ -5726,7 +5729,7 @@
         <w:spacing w:after="160"/>
       </w:pPr>
       <w:r>
-        <w:t>Bảng này biến timeline thành bốn câu hỏi có hoặc không. Chẳng hạn hết tuần hai thì đề tài đã chốt và proposal đã được xác nhận chưa, hết tuần bốn thì đã có bản thảo Chương 1, Chương 2 và sơ đồ mô hình chưa, cứ thế cho tới tuần tám. Cái hay của bảng này là các em tự biết mình có đang chậm hay không mà không cần ai nhắc, chỉ cần đặt cái đang có trong tay cạnh cột bên phải.</w:t>
+        <w:t>Bảng này biến timeline thành bốn câu hỏi có hoặc không. Chẳng hạn hết tuần hai thì đề tài đã chốt và proposal đã được xác nhận chưa, hết tuần bốn thì đã có bản thảo Chương 1, Chương 2 và sơ đồ mô hình chưa, cứ thế cho tới tuần tám. Cái hay của bảng này là các em tự biết mình có đang chậm hay không mà không cần ai nhắc, chỉ cần đặt những gì mình đang có trong tay cạnh cột sản phẩm bắt buộc.</w:t>
       </w:r>
     </w:p>
     <w:p>
@@ -5751,7 +5754,7 @@
         <w:t>sản phẩm của cặp tuần trước chính là nguyên liệu của cặp tuần sau</w:t>
       </w:r>
       <w:r>
-        <w:t>, nên thiếu một món là cả dây chuyền đứng lại. Kế hoạch chi tiết cho từng tuần riêng lẻ sẽ có ở Core Slide 2.</w:t>
+        <w:t>, nên thiếu một sản phẩm thì các việc phía sau đều bị kẹt lại. Kế hoạch chi tiết cho từng tuần riêng lẻ sẽ có ở Core Slide 2.</w:t>
       </w:r>
     </w:p>
     <w:p>
@@ -5772,7 +5775,7 @@
         <w:spacing w:after="160"/>
       </w:pPr>
       <w:r>
-        <w:t>Critical path, hay còn gọi là đường găng, là một khái niệm đến từ quản lý dự án. Hiểu đơn giản thì đó là chuỗi công việc mà việc sau chỉ bắt đầu được khi việc trước đã thật sự xong. Các em nhìn chuỗi trên slide sẽ thấy quen, vì nó chính là chuỗi nhân quả của proposal ở Phần bốn, giờ được đặt lên trục thời gian.</w:t>
+        <w:t>Critical path, hay còn gọi là đường găng, là một khái niệm đến từ quản lý dự án. Hiểu đơn giản thì đó là chuỗi công việc mà việc sau chỉ bắt đầu được khi việc trước đã thật sự xong. Các em nhìn chuỗi trên slide sẽ thấy quen, vì nó chính là chuỗi nhân quả của proposal ở Phần bốn, giờ được sắp xếp theo thời gian thực hiện.</w:t>
       </w:r>
     </w:p>
     <w:p>
@@ -5810,7 +5813,7 @@
         <w:rPr>
           <w:b/>
         </w:rPr>
-        <w:t>việc trên chuỗi thì làm đúng thứ tự, còn việc ngoài chuỗi thì dùng để lấp khoảng thời gian chờ.</w:t>
+        <w:t>việc nằm trên đường găng thì làm đúng thứ tự, còn việc nằm ngoài đường găng thì làm trong những lúc phải chờ các việc trên đường găng.</w:t>
       </w:r>
     </w:p>
     <w:p>
@@ -5831,7 +5834,7 @@
         <w:spacing w:after="160"/>
       </w:pPr>
       <w:r>
-        <w:t>Chuỗi găng còn đi tiếp qua Chương 4, Chương 5 rồi tới rà soát và nộp bài và trên toàn bộ chuỗi đó, slide chọn ra sáu mốc cần giữ đúng tiến độ hơn mọi việc khác.</w:t>
+        <w:t>Đường găng còn đi tiếp qua Chương 4, Chương 5 rồi tới rà soát và nộp bài. Trên toàn bộ đường găng đó, slide chọn ra sáu mốc cần giữ đúng tiến độ hơn mọi việc khác.</w:t>
       </w:r>
     </w:p>
     <w:p>
@@ -5955,7 +5958,7 @@
         <w:rPr>
           <w:b/>
         </w:rPr>
-        <w:t>mà đi sâu vào đúng những gì các em đã thấy khung ở đây.</w:t>
+        <w:t>mà đi sâu vào đúng những gì các em mới thấy ở mức khung tổng quát trong Core Slide 1.</w:t>
       </w:r>
     </w:p>
     <w:p>
@@ -5976,7 +5979,7 @@
         <w:spacing w:after="160"/>
       </w:pPr>
       <w:r>
-        <w:t>Năm kỹ năng trên slide, mỗi kỹ năng đều nối về một chỗ mình đã nói hôm nay. Viết đoạn văn học thuật nối về cách viết tổng quan có phê phán, làm sạch dữ liệu nối về mốc dữ liệu hợp lệ, diễn giải bảng kết quả nối về nhóm tiêu chí thứ năm, tìm kiếm tài liệu nối về tính toàn diện của phần tổng quan, còn trình bày và bảo vệ thì nối về phần điểm trình bày ở Phần mười một.</w:t>
+        <w:t>Năm kỹ năng trên slide, mỗi kỹ năng đều liên quan tới một nội dung mình đã nói hôm nay. Viết đoạn văn học thuật liên quan tới cách viết tổng quan có phê phán, làm sạch dữ liệu liên quan tới mốc dữ liệu hợp lệ, diễn giải bảng kết quả liên quan tới nhóm tiêu chí thứ năm, tìm kiếm tài liệu liên quan tới tính toàn diện của phần tổng quan, còn trình bày và bảo vệ thì liên quan tới phần điểm trình bày ở Phần mười một.</w:t>
       </w:r>
     </w:p>
     <w:p>
@@ -6057,15 +6060,15 @@
         <w:spacing w:after="160"/>
       </w:pPr>
       <w:r>
-        <w:t>Còn câu thứ ba nhắc tới checklist sáu câu ở Phần ba. Các em không nhớ đủ cả sáu câu cũng được nhưng câu về khả năng tiếp cận dữ liệu thì nhất định phải nhớ, vì như mình đã thấy ở Chương 3, đó là câu đỡ được nhiều rắc rối nhất về sau.</w:t>
-      </w:r>
-    </w:p>
-    <w:p>
-      <w:pPr>
-        <w:spacing w:after="160"/>
-      </w:pPr>
-      <w:r>
-        <w:t>Nếu còn lúng túng ở câu nào thì đó là tín hiệu để quay lại phần tương ứng, bởi vì nền tảng mà hổng thì phần kỹ thuật phía sau không bù được.</w:t>
+        <w:t>Còn câu thứ ba nhắc tới checklist sáu câu ở Phần ba. Các em không nhớ đủ cả sáu câu cũng được nhưng câu về khả năng tiếp cận dữ liệu thì nhất định phải nhớ, vì như mình đã thấy ở Chương 3, đó là câu giúp các em tránh được nhiều rắc rối nhất về sau.</w:t>
+      </w:r>
+    </w:p>
+    <w:p>
+      <w:pPr>
+        <w:spacing w:after="160"/>
+      </w:pPr>
+      <w:r>
+        <w:t>Nếu còn lúng túng ở câu nào thì đó là tín hiệu để quay lại phần tương ứng, bởi vì nền tảng tư duy còn chỗ chưa hiểu thì học thêm kỹ thuật phía sau cũng không bù lại được.</w:t>
       </w:r>
     </w:p>
     <w:p>
@@ -6086,7 +6089,7 @@
         <w:spacing w:after="160"/>
       </w:pPr>
       <w:r>
-        <w:t>Bốn câu tiếp theo là về khung xương của khóa luận, gồm năm chương, trích dẫn, tiêu chí chấm và tuần đầu tiên.</w:t>
+        <w:t>Bốn câu tiếp theo là về cấu trúc cốt lõi của khóa luận, gồm năm chương, trích dẫn, tiêu chí chấm và tuần đầu tiên.</w:t>
       </w:r>
     </w:p>
     <w:p>
@@ -6151,10 +6154,10 @@
         <w:rPr>
           <w:b/>
         </w:rPr>
-        <w:t>Đừng mang lỗ hổng từ giai đoạn hiểu sang giai đoạn làm</w:t>
-      </w:r>
-      <w:r>
-        <w:t>, bởi vì sang giai đoạn làm thì lỗ hổng đó sẽ tốn công hơn nhiều để lấp.</w:t>
+        <w:t>Đừng mang chỗ chưa hiểu từ giai đoạn học sang giai đoạn làm</w:t>
+      </w:r>
+      <w:r>
+        <w:t>, bởi vì khi đã bắt tay vào viết thì mỗi chỗ hiểu sai sẽ tốn công hơn nhiều để sửa.</w:t>
       </w:r>
     </w:p>
     <w:p>
@@ -6183,7 +6186,7 @@
         <w:spacing w:after="160"/>
       </w:pPr>
       <w:r>
-        <w:t>Mỗi mũi tên trên sơ đồ là một chỗ có thể bị đứt và thật ra cả buổi hôm nay mình chỉ làm một việc là chỉ cho các em từng chỗ có thể đứt cùng cách nối nó lại.</w:t>
+        <w:t>Mỗi mũi tên trên sơ đồ là một chỗ mà bước trước phải dẫn đúng sang bước sau. Nếu hai bước không khớp nhau thì cả hành trình bị lệch. Thật ra cả buổi hôm nay mình chỉ làm một việc là chỉ cho các em ở từng mũi tên đó hay xảy ra lỗi gì và làm sao để hai bước khớp lại với nhau.</w:t>
       </w:r>
     </w:p>
     <w:p>
@@ -6210,7 +6213,7 @@
         <w:spacing w:after="160"/>
       </w:pPr>
       <w:r>
-        <w:t>Core Slide 1 tới đây là kết thúc. Các em đã có trong tay tấm bản đồ, còn Core Slide 2 sẽ hướng dẫn từng bước đi cụ thể. Hẹn gặp lại các em ở đó.</w:t>
+        <w:t>Core Slide 1 tới đây là kết thúc. Các em đã có bức tranh toàn cảnh về khóa luận, còn Core Slide 2 sẽ hướng dẫn từng thao tác cụ thể. Hẹn gặp lại các em ở đó.</w:t>
       </w:r>
     </w:p>
     <w:sectPr>

</xml_diff>